<commit_message>
Add a second wave to the case-study paper: two post-delivery bugs
Extends the interaction table to seven turns and adds a new §5 covering the
two real defect reports found during actual use: the Off/Toggle fault
(traced back to the same lying status field §2 already documented, fixed by
tracking commanded state locally instead of trusting the device) and the
channel-name report that was a true symptom with the wrong diagnosis
(persistence was already correct; the real fault was two server instances
sharing a port). Revises the slot-7 (verification) grading in §7 to
distinguish verifying a build from verifying a thing in use, and folds both
findings into the effort accounting, discussion, and conclusion.

Co-Authored-By: Claude Sonnet 5 <noreply@anthropic.com>
</commit_message>
<xml_diff>
--- a/docs/qhub-relay-case-study.docx
+++ b/docs/qhub-relay-case-study.docx
@@ -90,6 +90,11 @@
     </w:p>
     <w:p>
       <w:r>
+        <w:t xml:space="preserve">That was the paper as first written. Real use added two more turns, and both are defect reports. Benchtop testing found that the Off button and Toggle did not turn off relays, though All Off did; the cause traced back to the same lying status field from §2, now leaking into logic built to interact with it, and the same voltage-sag technique that first caught the field caught this too. A second report, asking for persistent channel names and a timestamped log, turned out to describe a symptom with the wrong diagnosis: renaming already persisted correctly, and the real fault was two copies of the program silently answering the same port. Both defects escaped the verification that produced the first three turns. Neither could have been caught any other way than by running the finished thing and watching it fail. That sharpens the schema's verification slot rather than breaking it: live verification during a build and live verification during operation are not the same act, and passing one does not clear the other.</w:t>
+      </w:r>
+    </w:p>
+    <w:p>
+      <w:r>
         <w:rPr>
           <w:b/>
           <w:bCs/>
@@ -97,7 +102,7 @@
         <w:t xml:space="preserve">Keywords:</w:t>
       </w:r>
       <w:r>
-        <w:t xml:space="preserve"> code generation, large language models, human-AI interaction, requirements specification, reverse engineering, protocol discovery, binary decompilation, end-user programming.</w:t>
+        <w:t xml:space="preserve"> code generation, large language models, human-AI interaction, requirements specification, reverse engineering, protocol discovery, binary decompilation, end-user programming, field verification.</w:t>
       </w:r>
     </w:p>
     <w:p>
@@ -122,7 +127,7 @@
     </w:p>
     <w:p>
       <w:r>
-        <w:t xml:space="preserve">The device is an OTAQ Q-Hub: an underwater Ethernet switch with a built-in power relay, meant to sit in a wet enclosure on an uncrewed surface vehicle and switch power to whatever is plugged into its channels. OTAQ publishes a datasheet. It does not publish a protocol. Reaching the device meant recovering a wire format from nothing, and along the way distrusting two readings that looked plausible and were not. My aims are the same two the first two papers set out: record the artifact honestly, hard part included, then read the transcript against the schema. This time the transcript is short enough to read in full.</w:t>
+        <w:t xml:space="preserve">The device is an OTAQ Q-Hub: an underwater Ethernet switch with a built-in power relay, meant to sit in a wet enclosure on an uncrewed surface vehicle and switch power to whatever is plugged into its channels. OTAQ publishes a datasheet. It does not publish a protocol. Reaching the device meant recovering a wire format from nothing, and along the way distrusting two readings that looked plausible and were not. My aims are the same two the first two papers set out: record the artifact honestly, hard part included, then read the transcript against the schema. This time the transcript is short enough to read in full - or was, until real use extended it. §5 covers what came after.</w:t>
       </w:r>
     </w:p>
     <w:p>
@@ -337,7 +342,7 @@
         <w:t xml:space="preserve">allon</w:t>
       </w:r>
       <w:r>
-        <w:t xml:space="preserve">, consistent with six relay coils actually drawing current with nothing downstream to load them. The state fields, it turned out, report downstream current draw, not relay-contact position. With no load plugged into the bench unit, they will read "off" forever, correctly, because nothing is drawing power on any channel. This is the same shape of trap the second paper in this series found in a Starlink dish's telemetry: a field that is present, plausible, and measuring something other than what its name suggests.</w:t>
+        <w:t xml:space="preserve">, consistent with six relay coils actually drawing current with nothing downstream to load them. The state fields, it turned out, report downstream current draw, not relay-contact position. With no load plugged into the bench unit, they will read "off" forever, correctly, because nothing is drawing power on any channel. This is the same shape of trap the second paper in this series found in a Starlink dish's telemetry: a field that is present, plausible, and measuring something other than what its name suggests. §5 shows it was not finished causing trouble.</w:t>
       </w:r>
     </w:p>
     <w:p>
@@ -518,7 +523,25 @@
     </w:p>
     <w:p>
       <w:r>
-        <w:t xml:space="preserve">The tool came together in three user turns. That is short enough to read whole rather than condense into a table, but I keep the table for continuity with the first two papers.</w:t>
+        <w:t xml:space="preserve">The tool came together in three user turns, and the paper was the fourth. §5 covers three more, added after real use began. Table 1 now runs to seven rows; I keep small git-mechanical turns (</w:t>
+      </w:r>
+      <w:r>
+        <w:rPr>
+          <w:rFonts w:ascii="Consolas" w:cs="Consolas" w:eastAsia="Consolas" w:hAnsi="Consolas"/>
+        </w:rPr>
+        <w:t xml:space="preserve">commit</w:t>
+      </w:r>
+      <w:r>
+        <w:t xml:space="preserve">, </w:t>
+      </w:r>
+      <w:r>
+        <w:rPr>
+          <w:rFonts w:ascii="Consolas" w:cs="Consolas" w:eastAsia="Consolas" w:hAnsi="Consolas"/>
+        </w:rPr>
+        <w:t xml:space="preserve">push</w:t>
+      </w:r>
+      <w:r>
+        <w:t xml:space="preserve">, and a bare confirmation to a question I asked) folded into the substantive row they belong to, the same practice the first two papers used for layout and packaging turns.</w:t>
       </w:r>
     </w:p>
     <w:p>
@@ -1055,7 +1078,511 @@
                 <w:sz w:val="20"/>
                 <w:szCs w:val="20"/>
               </w:rPr>
-              <w:t xml:space="preserve">The present document</w:t>
+              <w:t xml:space="preserve">The present document, first draft</w:t>
+            </w:r>
+          </w:p>
+        </w:tc>
+      </w:tr>
+      <w:tr>
+        <w:tc>
+          <w:tcPr>
+            <w:tcW w:type="dxa" w:w="2340"/>
+            <w:tcBorders>
+              <w:top w:val="single" w:color="9CB6D9" w:sz="4"/>
+              <w:left w:val="single" w:color="9CB6D9" w:sz="4"/>
+              <w:bottom w:val="single" w:color="9CB6D9" w:sz="4"/>
+              <w:right w:val="single" w:color="9CB6D9" w:sz="4"/>
+            </w:tcBorders>
+            <w:tcMar>
+              <w:top w:type="dxa" w:w="60"/>
+              <w:left w:type="dxa" w:w="80"/>
+              <w:bottom w:type="dxa" w:w="60"/>
+              <w:right w:type="dxa" w:w="80"/>
+            </w:tcMar>
+          </w:tcPr>
+          <w:p>
+            <w:pPr>
+              <w:jc w:val="right"/>
+            </w:pPr>
+            <w:r>
+              <w:rPr>
+                <w:b w:val="false"/>
+                <w:bCs w:val="false"/>
+                <w:sz w:val="20"/>
+                <w:szCs w:val="20"/>
+              </w:rPr>
+              <w:t xml:space="preserve">4</w:t>
+            </w:r>
+          </w:p>
+        </w:tc>
+        <w:tc>
+          <w:tcPr>
+            <w:tcW w:type="dxa" w:w="2340"/>
+            <w:tcBorders>
+              <w:top w:val="single" w:color="9CB6D9" w:sz="4"/>
+              <w:left w:val="single" w:color="9CB6D9" w:sz="4"/>
+              <w:bottom w:val="single" w:color="9CB6D9" w:sz="4"/>
+              <w:right w:val="single" w:color="9CB6D9" w:sz="4"/>
+            </w:tcBorders>
+            <w:tcMar>
+              <w:top w:type="dxa" w:w="60"/>
+              <w:left w:type="dxa" w:w="80"/>
+              <w:bottom w:type="dxa" w:w="60"/>
+              <w:right w:type="dxa" w:w="80"/>
+            </w:tcMar>
+          </w:tcPr>
+          <w:p>
+            <w:pPr>
+              <w:jc w:val="left"/>
+            </w:pPr>
+            <w:r>
+              <w:rPr>
+                <w:b w:val="false"/>
+                <w:bCs w:val="false"/>
+                <w:sz w:val="20"/>
+                <w:szCs w:val="20"/>
+              </w:rPr>
+              <w:t xml:space="preserve">Move the paper into this project's own repository instead of Starlink's; set the repository private</w:t>
+            </w:r>
+          </w:p>
+        </w:tc>
+        <w:tc>
+          <w:tcPr>
+            <w:tcW w:type="dxa" w:w="2340"/>
+            <w:tcBorders>
+              <w:top w:val="single" w:color="9CB6D9" w:sz="4"/>
+              <w:left w:val="single" w:color="9CB6D9" w:sz="4"/>
+              <w:bottom w:val="single" w:color="9CB6D9" w:sz="4"/>
+              <w:right w:val="single" w:color="9CB6D9" w:sz="4"/>
+            </w:tcBorders>
+            <w:tcMar>
+              <w:top w:type="dxa" w:w="60"/>
+              <w:left w:type="dxa" w:w="80"/>
+              <w:bottom w:type="dxa" w:w="60"/>
+              <w:right w:type="dxa" w:w="80"/>
+            </w:tcMar>
+          </w:tcPr>
+          <w:p>
+            <w:pPr>
+              <w:jc w:val="left"/>
+            </w:pPr>
+            <w:r>
+              <w:rPr>
+                <w:b w:val="false"/>
+                <w:bCs w:val="false"/>
+                <w:sz w:val="20"/>
+                <w:szCs w:val="20"/>
+              </w:rPr>
+              <w:t xml:space="preserve">Packaging (structural) + Authorization (revised)</w:t>
+            </w:r>
+          </w:p>
+        </w:tc>
+        <w:tc>
+          <w:tcPr>
+            <w:tcW w:type="dxa" w:w="2340"/>
+            <w:tcBorders>
+              <w:top w:val="single" w:color="9CB6D9" w:sz="4"/>
+              <w:left w:val="single" w:color="9CB6D9" w:sz="4"/>
+              <w:bottom w:val="single" w:color="9CB6D9" w:sz="4"/>
+              <w:right w:val="single" w:color="9CB6D9" w:sz="4"/>
+            </w:tcBorders>
+            <w:tcMar>
+              <w:top w:type="dxa" w:w="60"/>
+              <w:left w:type="dxa" w:w="80"/>
+              <w:bottom w:type="dxa" w:w="60"/>
+              <w:right w:type="dxa" w:w="80"/>
+            </w:tcMar>
+          </w:tcPr>
+          <w:p>
+            <w:pPr>
+              <w:jc w:val="left"/>
+            </w:pPr>
+            <w:r>
+              <w:rPr>
+                <w:b w:val="false"/>
+                <w:bCs w:val="false"/>
+                <w:sz w:val="20"/>
+                <w:szCs w:val="20"/>
+              </w:rPr>
+              <w:t xml:space="preserve">Paper relocated; slot 6 of turn 1 revised after delivery, not at the checkpoint that produced it</w:t>
+            </w:r>
+          </w:p>
+        </w:tc>
+      </w:tr>
+      <w:tr>
+        <w:tc>
+          <w:tcPr>
+            <w:tcW w:type="dxa" w:w="2340"/>
+            <w:tcBorders>
+              <w:top w:val="single" w:color="9CB6D9" w:sz="4"/>
+              <w:left w:val="single" w:color="9CB6D9" w:sz="4"/>
+              <w:bottom w:val="single" w:color="9CB6D9" w:sz="4"/>
+              <w:right w:val="single" w:color="9CB6D9" w:sz="4"/>
+            </w:tcBorders>
+            <w:tcMar>
+              <w:top w:type="dxa" w:w="60"/>
+              <w:left w:type="dxa" w:w="80"/>
+              <w:bottom w:type="dxa" w:w="60"/>
+              <w:right w:type="dxa" w:w="80"/>
+            </w:tcMar>
+          </w:tcPr>
+          <w:p>
+            <w:pPr>
+              <w:jc w:val="right"/>
+            </w:pPr>
+            <w:r>
+              <w:rPr>
+                <w:b w:val="false"/>
+                <w:bCs w:val="false"/>
+                <w:sz w:val="20"/>
+                <w:szCs w:val="20"/>
+              </w:rPr>
+              <w:t xml:space="preserve">5</w:t>
+            </w:r>
+          </w:p>
+        </w:tc>
+        <w:tc>
+          <w:tcPr>
+            <w:tcW w:type="dxa" w:w="2340"/>
+            <w:tcBorders>
+              <w:top w:val="single" w:color="9CB6D9" w:sz="4"/>
+              <w:left w:val="single" w:color="9CB6D9" w:sz="4"/>
+              <w:bottom w:val="single" w:color="9CB6D9" w:sz="4"/>
+              <w:right w:val="single" w:color="9CB6D9" w:sz="4"/>
+            </w:tcBorders>
+            <w:tcMar>
+              <w:top w:type="dxa" w:w="60"/>
+              <w:left w:type="dxa" w:w="80"/>
+              <w:bottom w:type="dxa" w:w="60"/>
+              <w:right w:type="dxa" w:w="80"/>
+            </w:tcMar>
+          </w:tcPr>
+          <w:p>
+            <w:pPr>
+              <w:jc w:val="left"/>
+            </w:pPr>
+            <w:r>
+              <w:rPr>
+                <w:b w:val="false"/>
+                <w:bCs w:val="false"/>
+                <w:sz w:val="20"/>
+                <w:szCs w:val="20"/>
+              </w:rPr>
+              <w:t xml:space="preserve">Benchtop testing found the Off button and Toggle do not turn off relays; All Off works</w:t>
+            </w:r>
+          </w:p>
+        </w:tc>
+        <w:tc>
+          <w:tcPr>
+            <w:tcW w:type="dxa" w:w="2340"/>
+            <w:tcBorders>
+              <w:top w:val="single" w:color="9CB6D9" w:sz="4"/>
+              <w:left w:val="single" w:color="9CB6D9" w:sz="4"/>
+              <w:bottom w:val="single" w:color="9CB6D9" w:sz="4"/>
+              <w:right w:val="single" w:color="9CB6D9" w:sz="4"/>
+            </w:tcBorders>
+            <w:tcMar>
+              <w:top w:type="dxa" w:w="60"/>
+              <w:left w:type="dxa" w:w="80"/>
+              <w:bottom w:type="dxa" w:w="60"/>
+              <w:right w:type="dxa" w:w="80"/>
+            </w:tcMar>
+          </w:tcPr>
+          <w:p>
+            <w:pPr>
+              <w:jc w:val="left"/>
+            </w:pPr>
+            <w:r>
+              <w:rPr>
+                <w:b w:val="false"/>
+                <w:bCs w:val="false"/>
+                <w:sz w:val="20"/>
+                <w:szCs w:val="20"/>
+              </w:rPr>
+              <w:t xml:space="preserve">Defect report</w:t>
+            </w:r>
+          </w:p>
+        </w:tc>
+        <w:tc>
+          <w:tcPr>
+            <w:tcW w:type="dxa" w:w="2340"/>
+            <w:tcBorders>
+              <w:top w:val="single" w:color="9CB6D9" w:sz="4"/>
+              <w:left w:val="single" w:color="9CB6D9" w:sz="4"/>
+              <w:bottom w:val="single" w:color="9CB6D9" w:sz="4"/>
+              <w:right w:val="single" w:color="9CB6D9" w:sz="4"/>
+            </w:tcBorders>
+            <w:tcMar>
+              <w:top w:type="dxa" w:w="60"/>
+              <w:left w:type="dxa" w:w="80"/>
+              <w:bottom w:type="dxa" w:w="60"/>
+              <w:right w:type="dxa" w:w="80"/>
+            </w:tcMar>
+          </w:tcPr>
+          <w:p>
+            <w:pPr>
+              <w:jc w:val="left"/>
+            </w:pPr>
+            <w:r>
+              <w:rPr>
+                <w:b w:val="false"/>
+                <w:bCs w:val="false"/>
+                <w:sz w:val="20"/>
+                <w:szCs w:val="20"/>
+              </w:rPr>
+              <w:t xml:space="preserve">A state-tracking design flaw diagnosed and fixed (§5)</w:t>
+            </w:r>
+          </w:p>
+        </w:tc>
+      </w:tr>
+      <w:tr>
+        <w:tc>
+          <w:tcPr>
+            <w:tcW w:type="dxa" w:w="2340"/>
+            <w:tcBorders>
+              <w:top w:val="single" w:color="9CB6D9" w:sz="4"/>
+              <w:left w:val="single" w:color="9CB6D9" w:sz="4"/>
+              <w:bottom w:val="single" w:color="9CB6D9" w:sz="4"/>
+              <w:right w:val="single" w:color="9CB6D9" w:sz="4"/>
+            </w:tcBorders>
+            <w:tcMar>
+              <w:top w:type="dxa" w:w="60"/>
+              <w:left w:type="dxa" w:w="80"/>
+              <w:bottom w:type="dxa" w:w="60"/>
+              <w:right w:type="dxa" w:w="80"/>
+            </w:tcMar>
+          </w:tcPr>
+          <w:p>
+            <w:pPr>
+              <w:jc w:val="right"/>
+            </w:pPr>
+            <w:r>
+              <w:rPr>
+                <w:b w:val="false"/>
+                <w:bCs w:val="false"/>
+                <w:sz w:val="20"/>
+                <w:szCs w:val="20"/>
+              </w:rPr>
+              <w:t xml:space="preserve">6</w:t>
+            </w:r>
+          </w:p>
+        </w:tc>
+        <w:tc>
+          <w:tcPr>
+            <w:tcW w:type="dxa" w:w="2340"/>
+            <w:tcBorders>
+              <w:top w:val="single" w:color="9CB6D9" w:sz="4"/>
+              <w:left w:val="single" w:color="9CB6D9" w:sz="4"/>
+              <w:bottom w:val="single" w:color="9CB6D9" w:sz="4"/>
+              <w:right w:val="single" w:color="9CB6D9" w:sz="4"/>
+            </w:tcBorders>
+            <w:tcMar>
+              <w:top w:type="dxa" w:w="60"/>
+              <w:left w:type="dxa" w:w="80"/>
+              <w:bottom w:type="dxa" w:w="60"/>
+              <w:right w:type="dxa" w:w="80"/>
+            </w:tcMar>
+          </w:tcPr>
+          <w:p>
+            <w:pPr>
+              <w:jc w:val="left"/>
+            </w:pPr>
+            <w:r>
+              <w:rPr>
+                <w:b w:val="false"/>
+                <w:bCs w:val="false"/>
+                <w:sz w:val="20"/>
+                <w:szCs w:val="20"/>
+              </w:rPr>
+              <w:t xml:space="preserve">Make channel names persist across power cycles and missions; build a timestamped log of commands and status, using this computer's local time</w:t>
+            </w:r>
+          </w:p>
+        </w:tc>
+        <w:tc>
+          <w:tcPr>
+            <w:tcW w:type="dxa" w:w="2340"/>
+            <w:tcBorders>
+              <w:top w:val="single" w:color="9CB6D9" w:sz="4"/>
+              <w:left w:val="single" w:color="9CB6D9" w:sz="4"/>
+              <w:bottom w:val="single" w:color="9CB6D9" w:sz="4"/>
+              <w:right w:val="single" w:color="9CB6D9" w:sz="4"/>
+            </w:tcBorders>
+            <w:tcMar>
+              <w:top w:type="dxa" w:w="60"/>
+              <w:left w:type="dxa" w:w="80"/>
+              <w:bottom w:type="dxa" w:w="60"/>
+              <w:right w:type="dxa" w:w="80"/>
+            </w:tcMar>
+          </w:tcPr>
+          <w:p>
+            <w:pPr>
+              <w:jc w:val="left"/>
+            </w:pPr>
+            <w:r>
+              <w:rPr>
+                <w:b w:val="false"/>
+                <w:bCs w:val="false"/>
+                <w:sz w:val="20"/>
+                <w:szCs w:val="20"/>
+              </w:rPr>
+              <w:t xml:space="preserve">Specification (feature)</w:t>
+            </w:r>
+          </w:p>
+        </w:tc>
+        <w:tc>
+          <w:tcPr>
+            <w:tcW w:type="dxa" w:w="2340"/>
+            <w:tcBorders>
+              <w:top w:val="single" w:color="9CB6D9" w:sz="4"/>
+              <w:left w:val="single" w:color="9CB6D9" w:sz="4"/>
+              <w:bottom w:val="single" w:color="9CB6D9" w:sz="4"/>
+              <w:right w:val="single" w:color="9CB6D9" w:sz="4"/>
+            </w:tcBorders>
+            <w:tcMar>
+              <w:top w:type="dxa" w:w="60"/>
+              <w:left w:type="dxa" w:w="80"/>
+              <w:bottom w:type="dxa" w:w="60"/>
+              <w:right w:type="dxa" w:w="80"/>
+            </w:tcMar>
+          </w:tcPr>
+          <w:p>
+            <w:pPr>
+              <w:jc w:val="left"/>
+            </w:pPr>
+            <w:r>
+              <w:rPr>
+                <w:b w:val="false"/>
+                <w:bCs w:val="false"/>
+                <w:sz w:val="20"/>
+                <w:szCs w:val="20"/>
+              </w:rPr>
+              <w:t xml:space="preserve">A second, unrelated defect diagnosed behind an apparently-broken feature; a mission log and a single-instance guard built (§5)</w:t>
+            </w:r>
+          </w:p>
+        </w:tc>
+      </w:tr>
+      <w:tr>
+        <w:tc>
+          <w:tcPr>
+            <w:tcW w:type="dxa" w:w="2340"/>
+            <w:tcBorders>
+              <w:top w:val="single" w:color="9CB6D9" w:sz="4"/>
+              <w:left w:val="single" w:color="9CB6D9" w:sz="4"/>
+              <w:bottom w:val="single" w:color="9CB6D9" w:sz="4"/>
+              <w:right w:val="single" w:color="9CB6D9" w:sz="4"/>
+            </w:tcBorders>
+            <w:tcMar>
+              <w:top w:type="dxa" w:w="60"/>
+              <w:left w:type="dxa" w:w="80"/>
+              <w:bottom w:type="dxa" w:w="60"/>
+              <w:right w:type="dxa" w:w="80"/>
+            </w:tcMar>
+          </w:tcPr>
+          <w:p>
+            <w:pPr>
+              <w:jc w:val="right"/>
+            </w:pPr>
+            <w:r>
+              <w:rPr>
+                <w:b w:val="false"/>
+                <w:bCs w:val="false"/>
+                <w:sz w:val="20"/>
+                <w:szCs w:val="20"/>
+              </w:rPr>
+              <w:t xml:space="preserve">7</w:t>
+            </w:r>
+          </w:p>
+        </w:tc>
+        <w:tc>
+          <w:tcPr>
+            <w:tcW w:type="dxa" w:w="2340"/>
+            <w:tcBorders>
+              <w:top w:val="single" w:color="9CB6D9" w:sz="4"/>
+              <w:left w:val="single" w:color="9CB6D9" w:sz="4"/>
+              <w:bottom w:val="single" w:color="9CB6D9" w:sz="4"/>
+              <w:right w:val="single" w:color="9CB6D9" w:sz="4"/>
+            </w:tcBorders>
+            <w:tcMar>
+              <w:top w:type="dxa" w:w="60"/>
+              <w:left w:type="dxa" w:w="80"/>
+              <w:bottom w:type="dxa" w:w="60"/>
+              <w:right w:type="dxa" w:w="80"/>
+            </w:tcMar>
+          </w:tcPr>
+          <w:p>
+            <w:pPr>
+              <w:jc w:val="left"/>
+            </w:pPr>
+            <w:r>
+              <w:rPr>
+                <w:b w:val="false"/>
+                <w:bCs w:val="false"/>
+                <w:sz w:val="20"/>
+                <w:szCs w:val="20"/>
+              </w:rPr>
+              <w:t xml:space="preserve">Update the user intervention and bug identification process into the paper</w:t>
+            </w:r>
+          </w:p>
+        </w:tc>
+        <w:tc>
+          <w:tcPr>
+            <w:tcW w:type="dxa" w:w="2340"/>
+            <w:tcBorders>
+              <w:top w:val="single" w:color="9CB6D9" w:sz="4"/>
+              <w:left w:val="single" w:color="9CB6D9" w:sz="4"/>
+              <w:bottom w:val="single" w:color="9CB6D9" w:sz="4"/>
+              <w:right w:val="single" w:color="9CB6D9" w:sz="4"/>
+            </w:tcBorders>
+            <w:tcMar>
+              <w:top w:type="dxa" w:w="60"/>
+              <w:left w:type="dxa" w:w="80"/>
+              <w:bottom w:type="dxa" w:w="60"/>
+              <w:right w:type="dxa" w:w="80"/>
+            </w:tcMar>
+          </w:tcPr>
+          <w:p>
+            <w:pPr>
+              <w:jc w:val="left"/>
+            </w:pPr>
+            <w:r>
+              <w:rPr>
+                <w:b w:val="false"/>
+                <w:bCs w:val="false"/>
+                <w:sz w:val="20"/>
+                <w:szCs w:val="20"/>
+              </w:rPr>
+              <w:t xml:space="preserve">Meta</w:t>
+            </w:r>
+          </w:p>
+        </w:tc>
+        <w:tc>
+          <w:tcPr>
+            <w:tcW w:type="dxa" w:w="2340"/>
+            <w:tcBorders>
+              <w:top w:val="single" w:color="9CB6D9" w:sz="4"/>
+              <w:left w:val="single" w:color="9CB6D9" w:sz="4"/>
+              <w:bottom w:val="single" w:color="9CB6D9" w:sz="4"/>
+              <w:right w:val="single" w:color="9CB6D9" w:sz="4"/>
+            </w:tcBorders>
+            <w:tcMar>
+              <w:top w:type="dxa" w:w="60"/>
+              <w:left w:type="dxa" w:w="80"/>
+              <w:bottom w:type="dxa" w:w="60"/>
+              <w:right w:type="dxa" w:w="80"/>
+            </w:tcMar>
+          </w:tcPr>
+          <w:p>
+            <w:pPr>
+              <w:jc w:val="left"/>
+            </w:pPr>
+            <w:r>
+              <w:rPr>
+                <w:b w:val="false"/>
+                <w:bCs w:val="false"/>
+                <w:sz w:val="20"/>
+                <w:szCs w:val="20"/>
+              </w:rPr>
+              <w:t xml:space="preserve">This revision</w:t>
             </w:r>
           </w:p>
         </w:tc>
@@ -1074,7 +1601,7 @@
     </w:p>
     <w:p>
       <w:r>
-        <w:t xml:space="preserve">A smaller moment belongs here too, though it produced no table row of its own. Partway through turn 2, the agent asked, outside the running conversation's free text, whether to push the finished code to the public repository it had just created. I said not yet. The bench-testing authorization from turn 1 stayed in force the whole time; the authorization to make the work public did not carry over automatically, and got its own checkpoint. Authorization, in other words, is not a single grant that covers a project. It is renegotiated per action, as the blast radius of what is being authorized changes from a relay on a bench to a public commit.</w:t>
+        <w:t xml:space="preserve">A smaller moment belongs here too, though it produced no table row of its own. Partway through turn 2, the agent asked, outside the running conversation's free text, whether to push the finished code to the public repository it had just created. I said not yet. The bench-testing authorization from turn 1 stayed in force the whole time; the authorization to make the work public did not carry over automatically, and got its own checkpoint. Authorization, in other words, is not a single grant that covers a project. It is renegotiated per action, as the blast radius of what is being authorized changes from a relay on a bench to a public commit. The rest of the session bore this out mechanically. Every substantive turn after the first ended the same way, a change, then a separate question of whether to publish it: five checkpoints in all, one "not yet" and four "yes." The count tracks the number of times something left the machine, not the number of times something changed.</w:t>
       </w:r>
     </w:p>
     <w:p>
@@ -1089,22 +1616,78 @@
           <w:sz w:val="27"/>
           <w:szCs w:val="27"/>
         </w:rPr>
-        <w:t xml:space="preserve">5. What the schema removed, and what it could not</w:t>
-      </w:r>
-    </w:p>
-    <w:p>
-      <w:r>
-        <w:t xml:space="preserve">The first two papers spent a section asking which turns could have been folded into an earlier one. That question does not apply here in the same form, because turn 1 already was the folded-in version. The more useful question is what happened to the gap the schema was built to close, now that it was closed from the start.</w:t>
-      </w:r>
-    </w:p>
-    <w:p>
-      <w:r>
-        <w:t xml:space="preserve">In the first two projects, roughly half the recorded turns were corrections: a missing feature, a deferred packaging step, a requirement that surfaces only once the artifact exists to be argued with. None of that happened here. Turn 2 supplied no correction and no missing requirement; it granted scope the agent had proposed for itself. Turn 3 asked for a document. Between the opening line and a working, tested, packaged tool, there was no space for a specification gap to open up, because the specification did not have one.</w:t>
-      </w:r>
-    </w:p>
-    <w:p>
-      <w:r>
-        <w:t xml:space="preserve">What remained was discovery, in three pieces, and none of them were specifiable in advance by anyone. The wire protocol did not exist in writing anywhere I could have pointed the agent to; it had to be pulled out of a binary. The channel-state field's true meaning was not knowable without a working device to toggle and a voltage rail to watch sag. The IP field's placeholder value was not knowable without OTAQ's own software to check it against. This is the schema's central bet, now observed rather than argued: front-loading everything a domain expert already knows removes the correction turns, and only the correction turns, because discovery was never a gap in specification to begin with. It is a gap in what anyone, expert or agent, could have known before the device answered.</w:t>
+        <w:t xml:space="preserve">5. A second wave: bugs surfaced by real use</w:t>
+      </w:r>
+    </w:p>
+    <w:p>
+      <w:r>
+        <w:t xml:space="preserve">The first four turns produced a tool. Turns 5 and 6 are what happened when it was actually used, and both turned into defect reports the paper had not planned for. Reading them against §§2 and 4 is the point of this section.</w:t>
+      </w:r>
+    </w:p>
+    <w:p>
+      <w:r>
+        <w:rPr>
+          <w:b/>
+          <w:bCs/>
+        </w:rPr>
+        <w:t xml:space="preserve">Turn 5: a fault the build's own verification missed.</w:t>
+      </w:r>
+      <w:r>
+        <w:t xml:space="preserve"> The report was plain: the Off button did nothing, Toggle would not turn a channel off either, and All Off worked. The cause was already on the page, in §2, and I had simply not carried it far enough. The tool's on/off logic queried the device's channel-state field and sent a toggle only if that field disagreed with what was wanted. But §2 had already shown that field reads </w:t>
+      </w:r>
+      <w:r>
+        <w:rPr>
+          <w:rFonts w:ascii="Consolas" w:cs="Consolas" w:eastAsia="Consolas" w:hAnsi="Consolas"/>
+        </w:rPr>
+        <w:t xml:space="preserve">0</w:t>
+      </w:r>
+      <w:r>
+        <w:t xml:space="preserve"> regardless of real relay position. Since it always read "off," a request to turn a channel off always found the field already agreeing with it, and never sent anything. The fix was to stop asking the device a question it cannot answer honestly: on, off, and pulse now track their own record of what was last commanded, seeded only by All On or All Off, the two commands proven to set state outright rather than merely flip it. Per-channel controls stay disabled, with a banner explaining why, until one of those has run once. I verified the fix the same way I verified the original fault, by bracketing an On-button press and an Off-button press with raw voltage reads: 12.890 V, a sag to 12.836 V, a clean return to 12.890 V, each transition landing exactly on the button press that caused it.</w:t>
+      </w:r>
+    </w:p>
+    <w:p>
+      <w:r>
+        <w:t xml:space="preserve">What makes this turn worth a section of its own is not the fix. It is that the fault shipped past a build process this same paper describes as verifying everything live. I had toggled channels, pulsed them, run All On and All Off, all against the real device, all correctly. I had not specifically commanded Off on a channel I had first confirmed, by voltage, to be truly on. That is a narrow gap, and it is exactly the gap real use finds and a test plan written by the same person who wrote the code tends not to. Nothing in the schema's slot 7, "verify live," distinguishes verification performed while building from verification performed while operating. This case says it should have. The first is bounded by what the builder thought to try. The second is bounded by what the device is actually asked to do in the field, which is a larger and less predictable set.</w:t>
+      </w:r>
+    </w:p>
+    <w:p>
+      <w:r>
+        <w:rPr>
+          <w:b/>
+          <w:bCs/>
+        </w:rPr>
+        <w:t xml:space="preserve">Turn 6: a report that was right about the symptom and wrong about the cause.</w:t>
+      </w:r>
+      <w:r>
+        <w:t xml:space="preserve"> The ask was to make channel names survive power cycles and missions, and to add a timestamped log of commands and status, in local time. I checked the persistence code first, in isolation, before assuming it needed fixing: a channel renamed, then read back by a fresh </w:t>
+      </w:r>
+      <w:r>
+        <w:rPr>
+          <w:rFonts w:ascii="Consolas" w:cs="Consolas" w:eastAsia="Consolas" w:hAnsi="Consolas"/>
+        </w:rPr>
+        <w:t xml:space="preserve">Config</w:t>
+      </w:r>
+      <w:r>
+        <w:t xml:space="preserve"> object pointed at the same file, came back correctly. The code was not broken. But driving the actual running program through the same sequence, rename, restart, re-check, reproduced the complaint exactly: the old default name came back. The difference was not the code. It was that two copies of the server could end up bound to the same port at once, with no error from either, and answering requests unpredictably between them - old process, old config, new process, new config, whichever the operating system happened to route a given request to. A user restarting the program without confirming the first copy had exited would see precisely this: a rename that "didn't take." The fix was a startup check: on launch, ask whether something is already answering on the expected port, and if so, open the browser to it instead of racing it. The log itself, </w:t>
+      </w:r>
+      <w:r>
+        <w:rPr>
+          <w:rFonts w:ascii="Consolas" w:cs="Consolas" w:eastAsia="Consolas" w:hAnsi="Consolas"/>
+        </w:rPr>
+        <w:t xml:space="preserve">logs/qhub-log-&lt;date&gt;.csv</w:t>
+      </w:r>
+      <w:r>
+        <w:t xml:space="preserve">, records every command and every connection change with this machine's clock, since the device carries none of its own to log against - the feature as asked for, once the false lead was cleared.</w:t>
+      </w:r>
+    </w:p>
+    <w:p>
+      <w:r>
+        <w:t xml:space="preserve">The discipline this turn required was different from turn 5's. Turn 5 was a true defect report: believe it, find the mechanism, fix it. Turn 6's report was true as a symptom and wrong as a diagnosis, and accepting its framing at face value would have meant either patching code that was not broken or building a workaround for a bug that was never where it appeared to be. The obligation was to test the claim independent of the explanation attached to it, which is a variant of the same distrust that caught the lying fields in §2, aimed at a user's hypothesis instead of a device's telemetry.</w:t>
+      </w:r>
+    </w:p>
+    <w:p>
+      <w:r>
+        <w:t xml:space="preserve">Both turns are discovery in the sense §6 uses the word: neither could have been specified in advance, because neither fact existed to be known until the finished artifact was run under conditions the build did not cover. Where they differ from §2's discoveries is timing. The wire protocol and the two lying fields were found before delivery, during the work the schema explicitly assigns the agent. These two were found after delivery, during use the schema's slot 7 gestures at but does not fully name. The schema held up again. It just turned out to have a second act.</w:t>
       </w:r>
     </w:p>
     <w:p>
@@ -1119,230 +1702,22 @@
           <w:sz w:val="27"/>
           <w:szCs w:val="27"/>
         </w:rPr>
-        <w:t xml:space="preserve">6. The schema, tested from the opening line</w:t>
-      </w:r>
-    </w:p>
-    <w:p>
-      <w:r>
-        <w:t xml:space="preserve">The first paper proposed seven slots. The second graded them against a different project after the fact. Here I can grade the same slots against the turn that used them on purpose.</w:t>
-      </w:r>
-    </w:p>
-    <w:p>
-      <w:pPr>
-        <w:ind w:left="360"/>
-      </w:pPr>
-      <w:r>
-        <w:rPr>
-          <w:b/>
-          <w:bCs/>
-        </w:rPr>
-        <w:t xml:space="preserve">1. </w:t>
-      </w:r>
-      <w:r>
-        <w:rPr>
-          <w:b/>
-          <w:bCs/>
-        </w:rPr>
-        <w:t xml:space="preserve">Device and interface. </w:t>
-      </w:r>
-      <w:r>
-        <w:t xml:space="preserve">Filled precisely: address, manufacturer, both internal model numbers. </w:t>
-      </w:r>
-      <w:r>
-        <w:rPr>
-          <w:i/>
-          <w:iCs/>
-        </w:rPr>
-        <w:t xml:space="preserve">The model numbers turned out not to matter; decompilation cracked the protocol, not the silkscreen. But naming the manufacturer sent the agent looking for a vendor tool before it tried anything more exotic, and that tool was the whole discovery.</w:t>
-      </w:r>
-    </w:p>
-    <w:p>
-      <w:pPr>
-        <w:ind w:left="360"/>
-      </w:pPr>
-      <w:r>
-        <w:rPr>
-          <w:b/>
-          <w:bCs/>
-        </w:rPr>
-        <w:t xml:space="preserve">2. </w:t>
-      </w:r>
-      <w:r>
-        <w:rPr>
-          <w:b/>
-          <w:bCs/>
-        </w:rPr>
-        <w:t xml:space="preserve">Operational repertoire. </w:t>
-      </w:r>
-      <w:r>
-        <w:t xml:space="preserve">Filled completely: on, off, toggle, pulse, all-on, all-off, named in the opening line rather than added piecemeal as in the first project. </w:t>
-      </w:r>
-      <w:r>
-        <w:rPr>
-          <w:i/>
-          <w:iCs/>
-        </w:rPr>
-        <w:t xml:space="preserve">This is the slot a domain expert can always fill in full, because it is a list of your own hands-on actions, not a design decision.</w:t>
-      </w:r>
-    </w:p>
-    <w:p>
-      <w:pPr>
-        <w:ind w:left="360"/>
-      </w:pPr>
-      <w:r>
-        <w:rPr>
-          <w:b/>
-          <w:bCs/>
-        </w:rPr>
-        <w:t xml:space="preserve">3. </w:t>
-      </w:r>
-      <w:r>
-        <w:rPr>
-          <w:b/>
-          <w:bCs/>
-        </w:rPr>
-        <w:t xml:space="preserve">Field context and deployment. </w:t>
-      </w:r>
-      <w:r>
-        <w:t xml:space="preserve">Filled: an uncrewed surface vehicle, an unreliable link, must not wedge the device. </w:t>
-      </w:r>
-      <w:r>
-        <w:rPr>
-          <w:i/>
-          <w:iCs/>
-        </w:rPr>
-        <w:t xml:space="preserve">This single sentence produced the fresh-connection-per-command design and the timed lock in §3, without either being spelled out.</w:t>
-      </w:r>
-    </w:p>
-    <w:p>
-      <w:pPr>
-        <w:ind w:left="360"/>
-      </w:pPr>
-      <w:r>
-        <w:rPr>
-          <w:b/>
-          <w:bCs/>
-        </w:rPr>
-        <w:t xml:space="preserve">4. </w:t>
-      </w:r>
-      <w:r>
-        <w:rPr>
-          <w:b/>
-          <w:bCs/>
-        </w:rPr>
-        <w:t xml:space="preserve">Authorization and safety envelope. </w:t>
-      </w:r>
-      <w:r>
-        <w:t xml:space="preserve">Filled for the device: relays may be switched, nothing connected. </w:t>
-      </w:r>
-      <w:r>
-        <w:rPr>
-          <w:i/>
-          <w:iCs/>
-        </w:rPr>
-        <w:t xml:space="preserve">Not filled for what came later, the repository's visibility, which needed its own checkpoint mid-project (§4). The slot covers the device. It does not automatically cover everything downstream of the device.</w:t>
-      </w:r>
-    </w:p>
-    <w:p>
-      <w:pPr>
-        <w:ind w:left="360"/>
-      </w:pPr>
-      <w:r>
-        <w:rPr>
-          <w:b/>
-          <w:bCs/>
-        </w:rPr>
-        <w:t xml:space="preserve">5. </w:t>
-      </w:r>
-      <w:r>
-        <w:rPr>
-          <w:b/>
-          <w:bCs/>
-        </w:rPr>
-        <w:t xml:space="preserve">Deferred parameters. </w:t>
-      </w:r>
-      <w:r>
-        <w:t xml:space="preserve">Filled: channel names, left as placeholders. </w:t>
-      </w:r>
-      <w:r>
-        <w:rPr>
-          <w:i/>
-          <w:iCs/>
-        </w:rPr>
-        <w:t xml:space="preserve">Straightforward, and correctly deferred; naming them now would have meant guessing.</w:t>
-      </w:r>
-    </w:p>
-    <w:p>
-      <w:pPr>
-        <w:ind w:left="360"/>
-      </w:pPr>
-      <w:r>
-        <w:rPr>
-          <w:b/>
-          <w:bCs/>
-        </w:rPr>
-        <w:t xml:space="preserve">6. </w:t>
-      </w:r>
-      <w:r>
-        <w:rPr>
-          <w:b/>
-          <w:bCs/>
-        </w:rPr>
-        <w:t xml:space="preserve">Deliverable and distribution. </w:t>
-      </w:r>
-      <w:r>
-        <w:t xml:space="preserve">Filled: single runnable program, its own public repository, README, license, screenshot. </w:t>
-      </w:r>
-      <w:r>
-        <w:rPr>
-          <w:i/>
-          <w:iCs/>
-        </w:rPr>
-        <w:t xml:space="preserve">Collapsed what took three separate turns in the first project into one line here.</w:t>
-      </w:r>
-    </w:p>
-    <w:p>
-      <w:pPr>
-        <w:ind w:left="360"/>
-      </w:pPr>
-      <w:r>
-        <w:rPr>
-          <w:b/>
-          <w:bCs/>
-        </w:rPr>
-        <w:t xml:space="preserve">7. </w:t>
-      </w:r>
-      <w:r>
-        <w:rPr>
-          <w:b/>
-          <w:bCs/>
-        </w:rPr>
-        <w:t xml:space="preserve">Verification expectation. </w:t>
-      </w:r>
-      <w:r>
-        <w:t xml:space="preserve">Filled: verify live, or against a model if hardware is unavailable. </w:t>
-      </w:r>
-      <w:r>
-        <w:rPr>
-          <w:i/>
-          <w:iCs/>
-        </w:rPr>
-        <w:t xml:space="preserve">Hardware was available throughout, so this slot's fallback clause went unused, but its live-verification half did the most work in the paper: the voltage sag and the side-by-side vendor-app check are both instances of it.</w:t>
-      </w:r>
-    </w:p>
-    <w:p>
-      <w:r>
-        <w:t xml:space="preserve">All seven slots were filled, and filling them removed exactly the class of turn the schema claims to remove. The seam is turn 2. The schema has a slot for what you already know you need (2) and a slot for what you will permit the agent to do to a device (4). It has no slot for the case here: the agent, having built the thing, proposes more of it, and you decide how much of that proposal to accept. Calling that authorization stretches slot 4 past what it was built for; authorization is about the device, not about scope the agent invents after delivery. I would add an eighth, optional slot for a schema revision: </w:t>
-      </w:r>
-      <w:r>
-        <w:rPr>
-          <w:b/>
-          <w:bCs/>
-        </w:rPr>
-        <w:t xml:space="preserve">delegated scope</w:t>
-      </w:r>
-      <w:r>
-        <w:t xml:space="preserve">, permission for the agent to propose extensions beyond the stated repertoire and, on approval, to implement them under the same safety envelope named in slot 4, not a looser one. Turn 2 is a working example of an agent already behaving that way unprompted. Naming the slot would make it a designed behavior instead of a fortunate one.</w:t>
+        <w:t xml:space="preserve">6. What the schema removed, and what it could not</w:t>
+      </w:r>
+    </w:p>
+    <w:p>
+      <w:r>
+        <w:t xml:space="preserve">The first two papers spent a section asking which turns could have been folded into an earlier one. That question does not apply here in the same form, because turn 1 already was the folded-in version. The more useful question is what happened to the gap the schema was built to close, now that it was closed from the start.</w:t>
+      </w:r>
+    </w:p>
+    <w:p>
+      <w:r>
+        <w:t xml:space="preserve">In the first two projects, roughly half the recorded turns were corrections: a missing feature, a deferred packaging step, a requirement that surfaces only once the artifact exists to be argued with. None of that happened in the first three turns here. Turn 2 supplied no correction and no missing requirement; it granted scope the agent had proposed for itself. Turn 3 asked for a document. Between the opening line and a working, tested, packaged tool, there was no space for a specification gap to open up, because the specification did not have one.</w:t>
+      </w:r>
+    </w:p>
+    <w:p>
+      <w:r>
+        <w:t xml:space="preserve">What remained was discovery, in three pieces at first and two more later, and none of them were specifiable in advance by anyone. The wire protocol did not exist in writing anywhere I could have pointed the agent to; it had to be pulled out of a binary. The channel-state field's true meaning was not knowable without a working device to toggle and a voltage rail to watch sag. The IP field's placeholder value was not knowable without OTAQ's own software to check it against. Turns 5 and 6 (§5) add two more of the same kind, just later: the state-tracking fault was not knowable without a user turning a real channel off in the field, and the duplicate-instance fault was not knowable without a real restart under real conditions. This is the schema's central bet, now observed twice over: front-loading everything a domain expert already knows removes the correction turns, and only the correction turns, because discovery was never a gap in specification to begin with. It is a gap in what anyone, expert or agent, could have known before the device, or the deployed program, answered.</w:t>
       </w:r>
     </w:p>
     <w:p>
@@ -1357,7 +1732,260 @@
           <w:sz w:val="27"/>
           <w:szCs w:val="27"/>
         </w:rPr>
-        <w:t xml:space="preserve">7. How long it took, and how long it might otherwise have taken</w:t>
+        <w:t xml:space="preserve">7. The schema, tested from the opening line</w:t>
+      </w:r>
+    </w:p>
+    <w:p>
+      <w:r>
+        <w:t xml:space="preserve">The first paper proposed seven slots. The second graded them against a different project after the fact. Here I can grade the same slots against the turn that used them on purpose, and against what turned up afterward.</w:t>
+      </w:r>
+    </w:p>
+    <w:p>
+      <w:pPr>
+        <w:ind w:left="360"/>
+      </w:pPr>
+      <w:r>
+        <w:rPr>
+          <w:b/>
+          <w:bCs/>
+        </w:rPr>
+        <w:t xml:space="preserve">1. </w:t>
+      </w:r>
+      <w:r>
+        <w:rPr>
+          <w:b/>
+          <w:bCs/>
+        </w:rPr>
+        <w:t xml:space="preserve">Device and interface. </w:t>
+      </w:r>
+      <w:r>
+        <w:t xml:space="preserve">Filled precisely: address, manufacturer, both internal model numbers. </w:t>
+      </w:r>
+      <w:r>
+        <w:rPr>
+          <w:i/>
+          <w:iCs/>
+        </w:rPr>
+        <w:t xml:space="preserve">The model numbers turned out not to matter; decompilation cracked the protocol, not the silkscreen. But naming the manufacturer sent the agent looking for a vendor tool before it tried anything more exotic, and that tool was the whole discovery.</w:t>
+      </w:r>
+    </w:p>
+    <w:p>
+      <w:pPr>
+        <w:ind w:left="360"/>
+      </w:pPr>
+      <w:r>
+        <w:rPr>
+          <w:b/>
+          <w:bCs/>
+        </w:rPr>
+        <w:t xml:space="preserve">2. </w:t>
+      </w:r>
+      <w:r>
+        <w:rPr>
+          <w:b/>
+          <w:bCs/>
+        </w:rPr>
+        <w:t xml:space="preserve">Operational repertoire. </w:t>
+      </w:r>
+      <w:r>
+        <w:t xml:space="preserve">Filled completely: on, off, toggle, pulse, all-on, all-off, named in the opening line rather than added piecemeal as in the first project. </w:t>
+      </w:r>
+      <w:r>
+        <w:rPr>
+          <w:i/>
+          <w:iCs/>
+        </w:rPr>
+        <w:t xml:space="preserve">This is the slot a domain expert can always fill in full, because it is a list of your own hands-on actions, not a design decision.</w:t>
+      </w:r>
+    </w:p>
+    <w:p>
+      <w:pPr>
+        <w:ind w:left="360"/>
+      </w:pPr>
+      <w:r>
+        <w:rPr>
+          <w:b/>
+          <w:bCs/>
+        </w:rPr>
+        <w:t xml:space="preserve">3. </w:t>
+      </w:r>
+      <w:r>
+        <w:rPr>
+          <w:b/>
+          <w:bCs/>
+        </w:rPr>
+        <w:t xml:space="preserve">Field context and deployment. </w:t>
+      </w:r>
+      <w:r>
+        <w:t xml:space="preserve">Filled: an uncrewed surface vehicle, an unreliable link, must not wedge the device. </w:t>
+      </w:r>
+      <w:r>
+        <w:rPr>
+          <w:i/>
+          <w:iCs/>
+        </w:rPr>
+        <w:t xml:space="preserve">This single sentence produced the fresh-connection-per-command design and the timed lock in §3, without either being spelled out.</w:t>
+      </w:r>
+    </w:p>
+    <w:p>
+      <w:pPr>
+        <w:ind w:left="360"/>
+      </w:pPr>
+      <w:r>
+        <w:rPr>
+          <w:b/>
+          <w:bCs/>
+        </w:rPr>
+        <w:t xml:space="preserve">4. </w:t>
+      </w:r>
+      <w:r>
+        <w:rPr>
+          <w:b/>
+          <w:bCs/>
+        </w:rPr>
+        <w:t xml:space="preserve">Authorization and safety envelope. </w:t>
+      </w:r>
+      <w:r>
+        <w:t xml:space="preserve">Filled for the device: relays may be switched, nothing connected. </w:t>
+      </w:r>
+      <w:r>
+        <w:rPr>
+          <w:i/>
+          <w:iCs/>
+        </w:rPr>
+        <w:t xml:space="preserve">Not filled for what came later: the repository's visibility, revised after delivery rather than at the checkpoint that produced it (§4), and renegotiated five separate times over the life of the project as the blast radius of "push" kept recurring. The slot covers the device. It does not automatically cover everything downstream of the device, and satisfying it once does not mean it stays satisfied.</w:t>
+      </w:r>
+    </w:p>
+    <w:p>
+      <w:pPr>
+        <w:ind w:left="360"/>
+      </w:pPr>
+      <w:r>
+        <w:rPr>
+          <w:b/>
+          <w:bCs/>
+        </w:rPr>
+        <w:t xml:space="preserve">5. </w:t>
+      </w:r>
+      <w:r>
+        <w:rPr>
+          <w:b/>
+          <w:bCs/>
+        </w:rPr>
+        <w:t xml:space="preserve">Deferred parameters. </w:t>
+      </w:r>
+      <w:r>
+        <w:t xml:space="preserve">Filled: channel names, left as placeholders. </w:t>
+      </w:r>
+      <w:r>
+        <w:rPr>
+          <w:i/>
+          <w:iCs/>
+        </w:rPr>
+        <w:t xml:space="preserve">Straightforward, and correctly deferred; naming them now would have meant guessing.</w:t>
+      </w:r>
+    </w:p>
+    <w:p>
+      <w:pPr>
+        <w:ind w:left="360"/>
+      </w:pPr>
+      <w:r>
+        <w:rPr>
+          <w:b/>
+          <w:bCs/>
+        </w:rPr>
+        <w:t xml:space="preserve">6. </w:t>
+      </w:r>
+      <w:r>
+        <w:rPr>
+          <w:b/>
+          <w:bCs/>
+        </w:rPr>
+        <w:t xml:space="preserve">Deliverable and distribution. </w:t>
+      </w:r>
+      <w:r>
+        <w:t xml:space="preserve">Filled: single runnable program, its own public repository, README, license, screenshot. </w:t>
+      </w:r>
+      <w:r>
+        <w:rPr>
+          <w:i/>
+          <w:iCs/>
+        </w:rPr>
+        <w:t xml:space="preserve">Collapsed what took three separate turns in the first project into one line here - and was itself revised after the fact in turn 4, from public to private, which slot 6 as written does not anticipate either.</w:t>
+      </w:r>
+    </w:p>
+    <w:p>
+      <w:pPr>
+        <w:ind w:left="360"/>
+      </w:pPr>
+      <w:r>
+        <w:rPr>
+          <w:b/>
+          <w:bCs/>
+        </w:rPr>
+        <w:t xml:space="preserve">7. </w:t>
+      </w:r>
+      <w:r>
+        <w:rPr>
+          <w:b/>
+          <w:bCs/>
+        </w:rPr>
+        <w:t xml:space="preserve">Verification expectation. </w:t>
+      </w:r>
+      <w:r>
+        <w:t xml:space="preserve">Filled: verify live, or against a model if hardware is unavailable. </w:t>
+      </w:r>
+      <w:r>
+        <w:rPr>
+          <w:i/>
+          <w:iCs/>
+        </w:rPr>
+        <w:t xml:space="preserve">Hardware was available throughout, so this slot's fallback clause went unused, but its live-verification half did the most work in the paper: the voltage sag and the side-by-side vendor-app check are both instances of it. §5 complicates the credit. The tool passed exactly this kind of verification during the build and still shipped a fault that only real subsequent operation caught. "Verify live" turns out to name two different obligations, one bounded by what the builder thought to test, one bounded by what the device is actually asked to do afterward, and the slot as written does not yet tell them apart.</w:t>
+      </w:r>
+    </w:p>
+    <w:p>
+      <w:r>
+        <w:t xml:space="preserve">All seven slots were filled, and filling them removed exactly the class of turn the schema claims to remove. The seam from the original three turns is turn 2: the schema has a slot for what you already know you need (2) and a slot for what you will permit the agent to do to a device (4), but none for the agent proposing more of the artifact than was asked and the user deciding how much to accept. I proposed an eighth, optional slot for that in the paper's first draft: </w:t>
+      </w:r>
+      <w:r>
+        <w:rPr>
+          <w:b/>
+          <w:bCs/>
+        </w:rPr>
+        <w:t xml:space="preserve">delegated scope</w:t>
+      </w:r>
+      <w:r>
+        <w:t xml:space="preserve">, permission for the agent to propose extensions beyond the stated repertoire and, on approval, to implement them under the same safety envelope named in slot 4, not a looser one.</w:t>
+      </w:r>
+    </w:p>
+    <w:p>
+      <w:r>
+        <w:t xml:space="preserve">Turns 5 and 6 add a second seam, narrower but real. Slot 7 asks for a verification standard, and I gave one: verify live. What I did not specify, because I had not yet learned to, is that "live" has a before and an after, and a schema slot satisfied during the before is not thereby satisfied for the after. I do not think this needs a ninth slot; it needs slot 7's existing language broadened, something closer to </w:t>
+      </w:r>
+      <w:r>
+        <w:rPr>
+          <w:i/>
+          <w:iCs/>
+        </w:rPr>
+        <w:t xml:space="preserve">verify by: &lt;evidence required during the build, and how the same standard is meant to be reapplied once the thing is actually in use&gt;</w:t>
+      </w:r>
+      <w:r>
+        <w:t xml:space="preserve">. A schema that only certifies its own construction is a smaller thing than one that admits construction is not where verification ends.</w:t>
+      </w:r>
+    </w:p>
+    <w:p>
+      <w:pPr>
+        <w:keepNext/>
+        <w:spacing w:after="120" w:before="240"/>
+      </w:pPr>
+      <w:r>
+        <w:rPr>
+          <w:b/>
+          <w:bCs/>
+          <w:sz w:val="27"/>
+          <w:szCs w:val="27"/>
+        </w:rPr>
+        <w:t xml:space="preserve">8. How long it took, and how long it might otherwise have taken</w:t>
       </w:r>
     </w:p>
     <w:p>
@@ -1377,7 +2005,7 @@
           <w:sz w:val="23"/>
           <w:szCs w:val="23"/>
         </w:rPr>
-        <w:t xml:space="preserve">7.1 Method</w:t>
+        <w:t xml:space="preserve">8.1 Method</w:t>
       </w:r>
     </w:p>
     <w:p>
@@ -1387,7 +2015,12 @@
     </w:p>
     <w:p>
       <w:r>
-        <w:t xml:space="preserve">For the unaided side I estimate with the same three-point (PERT) method as before: expected effort </w:t>
+        <w:t xml:space="preserve">The two turns in §5 add a third and fourth burst, smaller than the first two. The paper's own repository commit landed at 10:17; the Off/Toggle fix, including the voltage-sag diagnosis and its own live re-verification, committed at 10:44, twenty-seven minutes later; the duplicate-instance fix and the mission log, including the false-lead investigation in turn 6, committed at 11:07, twenty-three minutes after that. Call the two together thirty to forty minutes of active effort, by the same rounded, uninstrumented convention as the rest of this section.</w:t>
+      </w:r>
+    </w:p>
+    <w:p>
+      <w:r>
+        <w:t xml:space="preserve">The baseline for the unaided side is a competent professional developer, a generous comparison given the person who actually directed the work calls himself a non-programmer. I estimate it with the same three-point (PERT) method as before: expected effort </w:t>
       </w:r>
       <w:r>
         <w:rPr>
@@ -1457,7 +2090,7 @@
         <w:t xml:space="preserve">a</w:t>
       </w:r>
       <w:r>
-        <w:t xml:space="preserve">)/6, components treated as independent so total variance is the sum of the parts. The baseline is a competent professional developer, a generous comparison given the person who actually directed the work calls himself a non-programmer.</w:t>
+        <w:t xml:space="preserve">)/6, components treated as independent so total variance is the sum of the parts. The table below is scoped to the original artifact, as it was in the first draft; I have not re-estimated the §5 fixes the same way, since a defect diagnosed by voltage-sag reasoning and a false lead cleared by direct reproduction do not decompose into the same kind of component list a fresh build does. Both, notably, lean on exactly the empirical-verification skill the discovery components below already price in.</w:t>
       </w:r>
     </w:p>
     <w:p>
@@ -1472,7 +2105,7 @@
           <w:sz w:val="23"/>
           <w:szCs w:val="23"/>
         </w:rPr>
-        <w:t xml:space="preserve">7.2 Result</w:t>
+        <w:t xml:space="preserve">8.2 Result</w:t>
       </w:r>
     </w:p>
     <w:p>
@@ -3633,7 +4266,7 @@
           <w:sz w:val="23"/>
           <w:szCs w:val="23"/>
         </w:rPr>
-        <w:t xml:space="preserve">7.3 Comparison</w:t>
+        <w:t xml:space="preserve">8.3 Comparison</w:t>
       </w:r>
     </w:p>
     <w:p>
@@ -3653,12 +4286,12 @@
           <w:sz w:val="23"/>
           <w:szCs w:val="23"/>
         </w:rPr>
-        <w:t xml:space="preserve">7.4 Threats to validity</w:t>
-      </w:r>
-    </w:p>
-    <w:p>
-      <w:r>
-        <w:t xml:space="preserve">The AI-coupled figure is an uninstrumented bound; the unaided figure is a modeled estimate, not a measurement, and both rest on n = 1, now n = 3 across the series but not aggregated into anything more than three separate data points pointing the same way. Three-point estimates drift with the estimator's anchor, and I am the same estimator across all three papers, which is a source of correlated bias I cannot rule out from inside the study. The professional baseline could run either way depending on the developer's prior exposure to .NET reverse engineering specifically; I widened the pessimistic discovery bound to absorb some of that uncertainty. As before, an effort ratio from one small instrument should not be stretched to larger systems, where architecture and maintenance dominate in ways a single conversation does not touch.</w:t>
+        <w:t xml:space="preserve">8.4 Threats to validity</w:t>
+      </w:r>
+    </w:p>
+    <w:p>
+      <w:r>
+        <w:t xml:space="preserve">The AI-coupled figure is an uninstrumented bound; the unaided figure is a modeled estimate, not a measurement, and both rest on n = 1, now n = 3 across the series but not aggregated into anything more than three separate data points pointing the same way. Three-point estimates drift with the estimator's anchor, and I am the same estimator across all three papers, which is a source of correlated bias I cannot rule out from inside the study. The professional baseline could run either way depending on the developer's prior exposure to .NET reverse engineering specifically; I widened the pessimistic discovery bound to absorb some of that uncertainty. As before, an effort ratio from one small instrument should not be stretched to larger systems, where architecture and maintenance dominate in ways a single conversation does not touch. The §5 figures are weaker still: two data points, no component breakdown, and a plausible bias toward looking fast because I already knew the codebase I was debugging.</w:t>
       </w:r>
     </w:p>
     <w:p>
@@ -3673,27 +4306,27 @@
           <w:sz w:val="27"/>
           <w:szCs w:val="27"/>
         </w:rPr>
-        <w:t xml:space="preserve">8. Discussion</w:t>
-      </w:r>
-    </w:p>
-    <w:p>
-      <w:r>
-        <w:t xml:space="preserve">The division of labor held a third time, and this time under a different test. The first two papers argued the schema would help, then showed it could be reconstructed from a transcript after the fact. This one opened with it and watched what happened. What happened is that the correction turns, the ones that made up roughly half of each earlier project, did not occur. What did not disappear was discovery: the wire protocol, the lying channel-state field, the lying IP field. All three came from probing a device and refusing its first answer, and no specification, however complete, could have supplied any of them, because they were not gaps in what I knew to ask for. They were gaps in what anyone, including OTAQ's own software, could know without running the device and watching it.</w:t>
-      </w:r>
-    </w:p>
-    <w:p>
-      <w:r>
-        <w:t xml:space="preserve">One result here is worth more weight than the numbers in §7: I wrote the schema, then used it on myself, unprompted, on a real subsequent project, and it produced the outcome it predicted. That is a different kind of evidence than grading a schema against a transcript, because it shows the pattern is not just something an analyst can find after the fact. It is something a practitioner can pick up and use going in. A method that only works in hindsight is a literary device. One a person reaches for on the next job is closer to a tool.</w:t>
-      </w:r>
-    </w:p>
-    <w:p>
-      <w:r>
-        <w:t xml:space="preserve">The agent's own restraint in §4, declining to exercise the IP-write path against real hardware despite a blanket grant to implement it, deserves its own note. A broad authorization ("implement all of your recommendations") did not get read as license to relax the caution a narrower, specific request would have carried. That is a property of this agent's judgment on this occasion, not a property of the schema, and I would not generalize it past n = 1. But it is exactly the kind of behavior the proposed eighth slot, delegated scope, is meant to name and hold in place rather than leave to chance.</w:t>
-      </w:r>
-    </w:p>
-    <w:p>
-      <w:r>
-        <w:t xml:space="preserve">The caveats from the first two papers still apply, sharpened by a third repetition rather than dissolved by it. This remains observation, not a controlled trial, and the estimator bias noted in §7.4 is new to this paper and real. The schema still assumes an agent capable of the kind of empirical discovery §2 describes; against a weaker one, slots 4 and 7 give back most of what they promise. Future work is the same paired study the first two papers called for, now with a third grounding case and, worth adding, a fourth condition: not just structured versus unstructured prompting, but a domain expert instructed to write their own opening request in the schema's form versus one left to discover it turn by turn, which is the comparison this paper approximates with a sample size of one author.</w:t>
+        <w:t xml:space="preserve">9. Discussion</w:t>
+      </w:r>
+    </w:p>
+    <w:p>
+      <w:r>
+        <w:t xml:space="preserve">The division of labor held a third time, and this time under a different test. The first two papers argued the schema would help, then showed it could be reconstructed from a transcript after the fact. This one opened with it and watched what happened. What happened is that the correction turns, the ones that made up roughly half of each earlier project, did not occur in the first three turns. What did not disappear was discovery: the wire protocol, the lying channel-state field, the lying IP field, and then, later, the state-tracking fault and the duplicate-instance fault. All five came from probing something, a device or a running program, and refusing its first answer, and no specification, however complete, could have supplied any of them, because they were not gaps in what I knew to ask for. They were gaps in what anyone, including OTAQ's own software and my own build-time testing, could know without running the thing and watching it.</w:t>
+      </w:r>
+    </w:p>
+    <w:p>
+      <w:r>
+        <w:t xml:space="preserve">One result here is worth more weight than the numbers in §8: I wrote the schema, then used it on myself, unprompted, on a real subsequent project, and it produced the outcome it predicted. That is a different kind of evidence than grading a schema against a transcript, because it shows the pattern is not just something an analyst can find after the fact. It is something a practitioner can pick up and use going in. A method that only works in hindsight is a literary device. One a person reaches for on the next job is closer to a tool.</w:t>
+      </w:r>
+    </w:p>
+    <w:p>
+      <w:r>
+        <w:t xml:space="preserve">The agent's own restraint in §4, declining to exercise the IP-write path against real hardware despite a blanket grant to implement it, deserves its own note, and §5 gives it a second data point of a different shape. Declining an authorized-but-risky action is caution under a grant. Catching a fault your own prior verification missed, then diagnosing a symptom that turned out to have the wrong explanation attached to it, is caution under a claim - not "may I," but "is this actually true, and if so, why." Both are a property of this agent's judgment on these particular occasions, not a property of the schema, and I would not generalize either past n = 1. But together they are the kind of behavior the proposed eighth slot, delegated scope, and the revision to slot 7 proposed in §7 are meant to name and hold in place rather than leave to chance.</w:t>
+      </w:r>
+    </w:p>
+    <w:p>
+      <w:r>
+        <w:t xml:space="preserve">The caveats from the first two papers still apply, sharpened by a third repetition rather than dissolved by it. This remains observation, not a controlled trial, and the estimator bias noted in §8.4 is new to this paper and real. The schema still assumes an agent capable of the kind of empirical discovery §2 describes, before delivery and, per §5, after it; against a weaker one, slots 4 and 7 give back most of what they promise. Future work is the same paired study the first two papers called for, now with a third grounding case and, worth adding, a fourth condition: not just structured versus unstructured prompting, but a domain expert instructed to write their own opening request in the schema's form versus one left to discover it turn by turn, which is the comparison this paper approximates with a sample size of one author. §5 suggests a fifth condition worth measuring separately: defect rate and time-to-diagnosis under real post-delivery use, since that is where this paper's own artifact was actually caught out.</w:t>
       </w:r>
     </w:p>
     <w:p>
@@ -3708,12 +4341,17 @@
           <w:sz w:val="27"/>
           <w:szCs w:val="27"/>
         </w:rPr>
-        <w:t xml:space="preserve">9. Conclusion</w:t>
-      </w:r>
-    </w:p>
-    <w:p>
-      <w:r>
-        <w:t xml:space="preserve">A field practitioner opened a project with a fully-formed, seven-slot specification, written from a schema he had proposed in an earlier paper, and watched an agent turn it into a tested, packaged, working tool with almost no further direction. The device's protocol was undocumented and actively resistant to probing; the agent recovered it by decompiling the vendor's own software, then caught two telemetry fields that reported something other than what their names claimed, checking one against a voltage reading and the other against the vendor's own application running side by side. The interaction ran to three turns, where the first two case studies in this series ran to eleven and eighteen. Reading the gap between them, I find the schema did what it was built to do: it removed the specification corrections, not the discovery, because discovery was never the schema's to remove. That is now a finding tested against a live application of the schema, not just an argument for one. Two prior cases pointed the same direction. This one is the first to start from the schema instead of arriving at it, and it arrived at the same place faster.</w:t>
+        <w:t xml:space="preserve">10. Conclusion</w:t>
+      </w:r>
+    </w:p>
+    <w:p>
+      <w:r>
+        <w:t xml:space="preserve">A field practitioner opened a project with a fully-formed, seven-slot specification, written from a schema he had proposed in an earlier paper, and watched an agent turn it into a tested, packaged, working tool with almost no further direction. The device's protocol was undocumented and actively resistant to probing; the agent recovered it by decompiling the vendor's own software, then caught two telemetry fields that reported something other than what their names claimed, checking one against a voltage reading and the other against the vendor's own application running side by side. The interaction ran to three turns, where the first two case studies in this series ran to eleven and eighteen. Reading the gap between them, I found the schema did what it was built to do: it removed the specification corrections, not the discovery, because discovery was never the schema's to remove.</w:t>
+      </w:r>
+    </w:p>
+    <w:p>
+      <w:r>
+        <w:t xml:space="preserve">Real use then supplied two more turns the paper had not planned for, and both were defect reports rather than corrections. One traced back to the same lying field the build had already found and distrusted, now leaking into logic that should have distrusted it too, caught only because a channel was actually switched off in the field and did not go off. The other looked like a broken feature and was in fact a different, unrelated fault, caught only by testing the claim rather than accepting its diagnosis. Both escaped a verification process this paper had already described as thorough. That is not a failure of the schema so much as a boundary it had not yet drawn: verifying a build and verifying a thing in use are different obligations, and passing the first does not discharge the second. Two prior cases pointed the same direction on the schema's central claim. This one is the first to start from the schema instead of arriving at it, the first to be used by its own author on a live project, and the first to keep going long enough to show where the schema's account of verification runs out.</w:t>
       </w:r>
     </w:p>
     <w:p>
@@ -3733,7 +4371,7 @@
     </w:p>
     <w:p>
       <w:r>
-        <w:t xml:space="preserve">The complete artifact, the device client, the manager layer, the web panel, and the packaged executable, is prepared at </w:t>
+        <w:t xml:space="preserve">The complete artifact, the device client, the manager layer, the web panel, the mission log, and the packaged executable, is prepared at </w:t>
       </w:r>
       <w:r>
         <w:rPr>
@@ -3742,7 +4380,7 @@
         <w:t xml:space="preserve">https://github.com/AndyMcLeod/qhub-relay-control</w:t>
       </w:r>
       <w:r>
-        <w:t xml:space="preserve"> under the MIT License. Turn 1 asked for a public repository; after review, the author set it to private instead, one more instance of the renegotiated authorization described in §4, this time revising a slot-6 term after delivery rather than at the checkpoint that produced it. The protocol in §2 was recovered by decompiling OTAQ's </w:t>
+        <w:t xml:space="preserve"> under the MIT License. Turn 1 asked for a public repository; after review, the author set it to private instead (turn 4), one more instance of the renegotiated authorization described in §4, this time revising a slot-6 term after delivery rather than at the checkpoint that produced it. The protocol in §2 was recovered by decompiling OTAQ's </w:t>
       </w:r>
       <w:r>
         <w:rPr>
@@ -3778,7 +4416,7 @@
         <w:t xml:space="preserve">allon</w:t>
       </w:r>
       <w:r>
-        <w:t xml:space="preserve"> command. The network-configuration field's placeholder value was confirmed against OTAQ's own application, run against the same live device.</w:t>
+        <w:t xml:space="preserve"> command. The network-configuration field's placeholder value was confirmed against OTAQ's own application, run against the same live device. The turn-5 fix was verified by the same voltage-sag method, bracketing the On and Off buttons specifically rather than the raw toggle command. The turn-6 fix was verified by reproducing the duplicate-instance condition directly (two processes launched in sequence, port ownership and response content both checked) and confirming a single, clean instance both persists a rename across a restart and continues the same day's log file rather than starting a new one.</w:t>
       </w:r>
     </w:p>
     <w:p>
@@ -3798,7 +4436,7 @@
     </w:p>
     <w:p>
       <w:r>
-        <w:t xml:space="preserve">The software artifact and a draft of this paper were generated by an LLM coding agent (Claude, Anthropic) under the direction of the human author, whose inputs are reproduced and analyzed in §4. Turn 1, reproduced there in condensed form, was itself written in the form the author's own earlier paper proposed. The paper's self-referential reading of that input, and of the schema it instantiates, should be taken with that provenance in mind.</w:t>
+        <w:t xml:space="preserve">The software artifact and a draft of this paper were generated by an LLM coding agent (Claude, Anthropic) under the direction of the human author, whose inputs are reproduced and analyzed in §4 and §5. Turn 1, reproduced in §4 in condensed form, was itself written in the form the author's own earlier paper proposed. The paper's self-referential reading of that input, and of the schema it instantiates, should be taken with that provenance in mind.</w:t>
       </w:r>
     </w:p>
     <w:sectPr>

</xml_diff>

<commit_message>
Update GUI screenshot in README and paper
Refresh screenshot.png and docs/qhub-relay-panel.png to the current control
panel: default channel-name placeholders, synced/all-off state, and the
Network settings and Mission log panels, neither of which existed when the
original screenshot was taken. Regenerate the paper's .docx with the new
figure embedded; existing captions still describe it accurately.

Co-Authored-By: Claude Sonnet 5 <noreply@anthropic.com>
</commit_message>
<xml_diff>
--- a/docs/qhub-relay-case-study.docx
+++ b/docs/qhub-relay-case-study.docx
@@ -445,7 +445,7 @@
       <w:r>
         <w:drawing>
           <wp:inline distT="0" distB="0" distL="0" distR="0">
-            <wp:extent cx="5486400" cy="2790825"/>
+            <wp:extent cx="5486400" cy="3095625"/>
             <wp:effectExtent t="0" r="0" b="0" l="0"/>
             <wp:docPr id="1" name="" descr="" title=""/>
             <wp:cNvGraphicFramePr>
@@ -470,7 +470,7 @@
                   <pic:spPr bwMode="auto">
                     <a:xfrm>
                       <a:off x="0" y="0"/>
-                      <a:ext cx="5486400" cy="2790825"/>
+                      <a:ext cx="5486400" cy="3095625"/>
                     </a:xfrm>
                     <a:prstGeom prst="rect">
                       <a:avLst/>

</xml_diff>